<commit_message>
Add vital pulp therapy treatment option; update pain management preset
- Treatment plan: third option "Primary root canal treatment - vital pulp therapy"
  (new checkbox line in the template after Endodontic retreatment)
- Pain management preset: Paracetamol 500mg for up to 1 week

Co-Authored-By: Claude Opus 5.5 <noreply@anthropic.com>
Claude-Session: https://claude.ai/code/session_014QzyJNshTrTEDRpXzuacGg
</commit_message>
<xml_diff>
--- a/src/template.docx
+++ b/src/template.docx
@@ -5112,6 +5112,30 @@
           <w:sz w:val="20"/>
         </w:rPr>
         <w:t xml:space="preserve">retreatment </w:t>
+      </w:r>
+    </w:p>
+    <w:p>
+      <w:pPr>
+        <w:pStyle w:val="ListParagraph"/>
+        <w:numPr>
+          <w:ilvl w:val="0"/>
+          <w:numId w:val="1"/>
+        </w:numPr>
+        <w:tabs>
+          <w:tab w:val="left" w:pos="290"/>
+        </w:tabs>
+        <w:spacing w:before="104"/>
+        <w:ind w:left="290" w:hanging="255"/>
+        <w:contextualSpacing w:val="0"/>
+        <w:rPr>
+          <w:sz w:val="20"/>
+        </w:rPr>
+      </w:pPr>
+      <w:r>
+        <w:rPr>
+          <w:sz w:val="20"/>
+        </w:rPr>
+        <w:t>Primary root canal treatment - vital pulp therapy</w:t>
       </w:r>
     </w:p>
     <w:p>

</xml_diff>

<commit_message>
Fix blank pages in the generated logbook
- Remove empty spacer paragraphs before each page break and make the
  page-break paragraphs near-zero height, so a full page no longer spills
  an empty page after it
- Keep "Endodontic retreatment" on one line (frees the space taken by the
  new vital pulp therapy option)
- Case No and Date share one line, with Date right-aligned

Co-Authored-By: Claude Opus 5.5 <noreply@anthropic.com>
Claude-Session: https://claude.ai/code/session_014QzyJNshTrTEDRpXzuacGg
</commit_message>
<xml_diff>
--- a/src/template.docx
+++ b/src/template.docx
@@ -530,32 +530,15 @@
     </w:p>
     <w:p>
       <w:pPr>
-        <w:pStyle w:val="BodyText"/>
-        <w:spacing w:before="0"/>
-        <w:rPr>
-          <w:rFonts w:ascii="Arial"/>
-          <w:b/>
-          <w:sz w:val="30"/>
-        </w:rPr>
-      </w:pPr>
-    </w:p>
-    <w:p>
-      <w:pPr>
-        <w:pStyle w:val="BodyText"/>
-        <w:spacing w:before="73"/>
-        <w:rPr>
-          <w:rFonts w:ascii="Arial"/>
-          <w:b/>
-          <w:sz w:val="30"/>
-        </w:rPr>
-      </w:pPr>
-    </w:p>
-    <w:p>
-      <w:pPr>
         <w:pStyle w:val="Heading1"/>
+        <w:spacing w:before="0" w:after="0" w:line="20" w:lineRule="exact"/>
         <w:pBdr>
           <w:bottom w:val="single" w:sz="4" w:space="1" w:color="auto"/>
         </w:pBdr>
+        <w:rPr>
+          <w:sz w:val="2"/>
+          <w:szCs w:val="2"/>
+        </w:rPr>
         <w:sectPr>
           <w:pgSz w:w="11910" w:h="16840"/>
           <w:pgMar w:top="840" w:right="992" w:bottom="280" w:left="992" w:header="720" w:footer="720" w:gutter="0"/>
@@ -1894,29 +1877,10 @@
     <w:p>
       <w:pPr>
         <w:pStyle w:val="BodyText"/>
-        <w:spacing w:before="74"/>
-        <w:ind w:left="35"/>
-      </w:pPr>
-    </w:p>
-    <w:p>
-      <w:pPr>
-        <w:pStyle w:val="ListParagraph"/>
-        <w:tabs>
-          <w:tab w:val="left" w:pos="290"/>
-        </w:tabs>
-        <w:spacing w:before="104" w:line="456" w:lineRule="auto"/>
-        <w:ind w:left="35" w:right="7850"/>
-        <w:contextualSpacing w:val="0"/>
-        <w:rPr>
-          <w:sz w:val="20"/>
-        </w:rPr>
-      </w:pPr>
-    </w:p>
-    <w:p>
-      <w:pPr>
-        <w:pStyle w:val="BodyText"/>
-        <w:rPr>
-          <w:sz w:val="16"/>
+        <w:spacing w:before="0" w:after="0" w:line="20" w:lineRule="exact"/>
+        <w:rPr>
+          <w:sz w:val="2"/>
+          <w:szCs w:val="2"/>
         </w:rPr>
         <w:sectPr>
           <w:pgSz w:w="11910" w:h="16840"/>
@@ -3416,20 +3380,6 @@
     <w:p>
       <w:pPr>
         <w:pStyle w:val="ListParagraph"/>
-        <w:tabs>
-          <w:tab w:val="left" w:pos="290"/>
-        </w:tabs>
-        <w:spacing w:before="2"/>
-        <w:ind w:left="160"/>
-        <w:rPr>
-          <w:spacing w:val="-2"/>
-          <w:sz w:val="20"/>
-        </w:rPr>
-      </w:pPr>
-    </w:p>
-    <w:p>
-      <w:pPr>
-        <w:pStyle w:val="ListParagraph"/>
         <w:numPr>
           <w:ilvl w:val="1"/>
           <w:numId w:val="7"/>
@@ -4323,8 +4273,10 @@
     <w:p>
       <w:pPr>
         <w:pStyle w:val="BodyText"/>
-        <w:rPr>
-          <w:sz w:val="16"/>
+        <w:spacing w:before="0" w:after="0" w:line="20" w:lineRule="exact"/>
+        <w:rPr>
+          <w:sz w:val="2"/>
+          <w:szCs w:val="2"/>
         </w:rPr>
         <w:sectPr>
           <w:pgSz w:w="11910" w:h="16840"/>
@@ -5087,8 +5039,8 @@
         <w:tabs>
           <w:tab w:val="left" w:pos="290"/>
         </w:tabs>
-        <w:spacing w:before="104" w:line="348" w:lineRule="auto"/>
-        <w:ind w:right="7549" w:firstLine="0"/>
+        <w:spacing w:before="104"/>
+        <w:ind w:left="290" w:hanging="255"/>
         <w:contextualSpacing w:val="0"/>
         <w:rPr>
           <w:sz w:val="20"/>
@@ -5621,36 +5573,10 @@
     <w:p>
       <w:pPr>
         <w:pStyle w:val="BodyText"/>
-        <w:rPr>
-          <w:sz w:val="16"/>
-        </w:rPr>
-      </w:pPr>
-    </w:p>
-    <w:p>
-      <w:pPr>
-        <w:pStyle w:val="BodyText"/>
-        <w:spacing w:before="20"/>
-      </w:pPr>
-    </w:p>
-    <w:p>
-      <w:pPr>
-        <w:pStyle w:val="BodyText"/>
-        <w:rPr>
-          <w:sz w:val="16"/>
-        </w:rPr>
-      </w:pPr>
-    </w:p>
-    <w:p>
-      <w:pPr>
-        <w:pStyle w:val="BodyText"/>
-        <w:spacing w:before="20"/>
-      </w:pPr>
-    </w:p>
-    <w:p>
-      <w:pPr>
-        <w:pStyle w:val="BodyText"/>
-        <w:rPr>
-          <w:sz w:val="16"/>
+        <w:spacing w:before="0" w:after="0" w:line="20" w:lineRule="exact"/>
+        <w:rPr>
+          <w:sz w:val="2"/>
+          <w:szCs w:val="2"/>
         </w:rPr>
         <w:sectPr>
           <w:pgSz w:w="11910" w:h="16840"/>
@@ -7592,30 +7518,10 @@
     <w:p>
       <w:pPr>
         <w:pStyle w:val="BodyText"/>
-        <w:rPr>
-          <w:sz w:val="16"/>
-        </w:rPr>
-      </w:pPr>
-    </w:p>
-    <w:p>
-      <w:pPr>
-        <w:pStyle w:val="BodyText"/>
-        <w:spacing w:before="20"/>
-      </w:pPr>
-    </w:p>
-    <w:p>
-      <w:pPr>
-        <w:pStyle w:val="BodyText"/>
-        <w:rPr>
-          <w:sz w:val="16"/>
-        </w:rPr>
-      </w:pPr>
-    </w:p>
-    <w:p>
-      <w:pPr>
-        <w:pStyle w:val="BodyText"/>
-        <w:rPr>
-          <w:sz w:val="16"/>
+        <w:spacing w:before="0" w:after="0" w:line="20" w:lineRule="exact"/>
+        <w:rPr>
+          <w:sz w:val="2"/>
+          <w:szCs w:val="2"/>
         </w:rPr>
         <w:sectPr>
           <w:pgSz w:w="11910" w:h="16840"/>
@@ -9299,22 +9205,10 @@
     <w:p>
       <w:pPr>
         <w:pStyle w:val="BodyText"/>
-        <w:rPr>
-          <w:sz w:val="16"/>
-        </w:rPr>
-      </w:pPr>
-    </w:p>
-    <w:p>
-      <w:pPr>
-        <w:pStyle w:val="BodyText"/>
-        <w:spacing w:before="20"/>
-      </w:pPr>
-    </w:p>
-    <w:p>
-      <w:pPr>
-        <w:pStyle w:val="BodyText"/>
-        <w:rPr>
-          <w:sz w:val="16"/>
+        <w:spacing w:before="0" w:after="0" w:line="20" w:lineRule="exact"/>
+        <w:rPr>
+          <w:sz w:val="2"/>
+          <w:szCs w:val="2"/>
         </w:rPr>
         <w:sectPr>
           <w:pgSz w:w="11910" w:h="16840"/>
@@ -9744,9 +9638,10 @@
     <w:p>
       <w:pPr>
         <w:pStyle w:val="TableParagraph"/>
-        <w:rPr>
-          <w:rFonts w:ascii="Times New Roman"/>
-          <w:sz w:val="18"/>
+        <w:spacing w:before="0" w:after="0" w:line="20" w:lineRule="exact"/>
+        <w:rPr>
+          <w:sz w:val="2"/>
+          <w:szCs w:val="2"/>
         </w:rPr>
         <w:sectPr>
           <w:pgSz w:w="11910" w:h="16840"/>

</xml_diff>